<commit_message>
Remove the empty paragraphs that pushed invoices onto a second page
The invoice template ended with eight empty paragraphs after the energy
text. Word fitted them on page one. LibreOffice lays text out slightly
taller and moved them to a second page, which held nothing but the
footer. Only those paragraphs are removed; every other part of the
.docx is unchanged.

Checked against real Q3 invoices: members with one or two meters now
get one page. Members with many invoice lines, or three or more meters,
still need two (see the follow-up on the chart and summary layout).

Co-Authored-By: Claude Opus 5.5 <noreply@anthropic.com>
</commit_message>
<xml_diff>
--- a/templates/template_invoice_clean.docx
+++ b/templates/template_invoice_clean.docx
@@ -2072,189 +2072,6 @@
         </w:tc>
       </w:tr>
     </w:tbl>
-    <w:p>
-      <w:pPr>
-        <w:pStyle w:val="Normal"/>
-        <w:tabs>
-          <w:tab w:val="clear" w:pos="709"/>
-          <w:tab w:val="left" w:pos="720" w:leader="none"/>
-        </w:tabs>
-        <w:bidi w:val="0"/>
-        <w:jc w:val="left"/>
-        <w:rPr>
-          <w:rFonts w:ascii="DejaVu Sans" w:hAnsi="DejaVu Sans"/>
-          <w:sz w:val="20"/>
-          <w:szCs w:val="20"/>
-        </w:rPr>
-      </w:pPr>
-      <w:r>
-        <w:rPr>
-          <w:rFonts w:ascii="DejaVu Sans" w:hAnsi="DejaVu Sans"/>
-          <w:sz w:val="20"/>
-          <w:szCs w:val="20"/>
-        </w:rPr>
-      </w:r>
-    </w:p>
-    <w:p>
-      <w:pPr>
-        <w:pStyle w:val="Normal"/>
-        <w:tabs>
-          <w:tab w:val="clear" w:pos="709"/>
-          <w:tab w:val="left" w:pos="720" w:leader="none"/>
-        </w:tabs>
-        <w:bidi w:val="0"/>
-        <w:jc w:val="left"/>
-        <w:rPr>
-          <w:rFonts w:ascii="DejaVu Sans" w:hAnsi="DejaVu Sans"/>
-          <w:sz w:val="20"/>
-          <w:szCs w:val="20"/>
-        </w:rPr>
-      </w:pPr>
-      <w:r>
-        <w:rPr>
-          <w:rFonts w:ascii="DejaVu Sans" w:hAnsi="DejaVu Sans"/>
-          <w:sz w:val="20"/>
-          <w:szCs w:val="20"/>
-        </w:rPr>
-      </w:r>
-    </w:p>
-    <w:p>
-      <w:pPr>
-        <w:pStyle w:val="Normal"/>
-        <w:tabs>
-          <w:tab w:val="clear" w:pos="709"/>
-          <w:tab w:val="left" w:pos="720" w:leader="none"/>
-        </w:tabs>
-        <w:bidi w:val="0"/>
-        <w:jc w:val="left"/>
-        <w:rPr>
-          <w:rFonts w:ascii="DejaVu Sans" w:hAnsi="DejaVu Sans"/>
-          <w:sz w:val="20"/>
-          <w:szCs w:val="20"/>
-        </w:rPr>
-      </w:pPr>
-      <w:r>
-        <w:rPr>
-          <w:rFonts w:ascii="DejaVu Sans" w:hAnsi="DejaVu Sans"/>
-          <w:sz w:val="20"/>
-          <w:szCs w:val="20"/>
-        </w:rPr>
-      </w:r>
-    </w:p>
-    <w:p>
-      <w:pPr>
-        <w:pStyle w:val="Normal"/>
-        <w:tabs>
-          <w:tab w:val="clear" w:pos="709"/>
-          <w:tab w:val="left" w:pos="720" w:leader="none"/>
-        </w:tabs>
-        <w:bidi w:val="0"/>
-        <w:jc w:val="left"/>
-        <w:rPr>
-          <w:rFonts w:ascii="DejaVu Sans" w:hAnsi="DejaVu Sans"/>
-          <w:sz w:val="20"/>
-          <w:szCs w:val="20"/>
-        </w:rPr>
-      </w:pPr>
-      <w:r>
-        <w:rPr>
-          <w:rFonts w:ascii="DejaVu Sans" w:hAnsi="DejaVu Sans"/>
-          <w:sz w:val="20"/>
-          <w:szCs w:val="20"/>
-        </w:rPr>
-      </w:r>
-    </w:p>
-    <w:p>
-      <w:pPr>
-        <w:pStyle w:val="Normal"/>
-        <w:tabs>
-          <w:tab w:val="clear" w:pos="709"/>
-          <w:tab w:val="left" w:pos="720" w:leader="none"/>
-        </w:tabs>
-        <w:bidi w:val="0"/>
-        <w:jc w:val="left"/>
-        <w:rPr>
-          <w:rFonts w:ascii="DejaVu Sans" w:hAnsi="DejaVu Sans"/>
-          <w:sz w:val="20"/>
-          <w:szCs w:val="20"/>
-        </w:rPr>
-      </w:pPr>
-      <w:r>
-        <w:rPr>
-          <w:rFonts w:ascii="DejaVu Sans" w:hAnsi="DejaVu Sans"/>
-          <w:sz w:val="20"/>
-          <w:szCs w:val="20"/>
-        </w:rPr>
-      </w:r>
-    </w:p>
-    <w:p>
-      <w:pPr>
-        <w:pStyle w:val="Normal"/>
-        <w:tabs>
-          <w:tab w:val="clear" w:pos="709"/>
-          <w:tab w:val="left" w:pos="720" w:leader="none"/>
-        </w:tabs>
-        <w:bidi w:val="0"/>
-        <w:jc w:val="left"/>
-        <w:rPr>
-          <w:rFonts w:ascii="DejaVu Sans" w:hAnsi="DejaVu Sans"/>
-          <w:sz w:val="20"/>
-          <w:szCs w:val="20"/>
-        </w:rPr>
-      </w:pPr>
-      <w:r>
-        <w:rPr>
-          <w:rFonts w:ascii="DejaVu Sans" w:hAnsi="DejaVu Sans"/>
-          <w:sz w:val="20"/>
-          <w:szCs w:val="20"/>
-        </w:rPr>
-      </w:r>
-    </w:p>
-    <w:p>
-      <w:pPr>
-        <w:pStyle w:val="Normal"/>
-        <w:tabs>
-          <w:tab w:val="clear" w:pos="709"/>
-          <w:tab w:val="left" w:pos="720" w:leader="none"/>
-        </w:tabs>
-        <w:bidi w:val="0"/>
-        <w:jc w:val="left"/>
-        <w:rPr>
-          <w:rFonts w:ascii="DejaVu Sans" w:hAnsi="DejaVu Sans"/>
-          <w:sz w:val="20"/>
-          <w:szCs w:val="20"/>
-        </w:rPr>
-      </w:pPr>
-      <w:r>
-        <w:rPr>
-          <w:rFonts w:ascii="DejaVu Sans" w:hAnsi="DejaVu Sans"/>
-          <w:sz w:val="20"/>
-          <w:szCs w:val="20"/>
-        </w:rPr>
-      </w:r>
-    </w:p>
-    <w:p>
-      <w:pPr>
-        <w:pStyle w:val="Normal"/>
-        <w:tabs>
-          <w:tab w:val="clear" w:pos="709"/>
-          <w:tab w:val="left" w:pos="720" w:leader="none"/>
-        </w:tabs>
-        <w:bidi w:val="0"/>
-        <w:jc w:val="left"/>
-        <w:rPr>
-          <w:rFonts w:ascii="DejaVu Sans" w:hAnsi="DejaVu Sans"/>
-        </w:rPr>
-      </w:pPr>
-      <w:r>
-        <w:rPr>
-          <w:rFonts w:ascii="DejaVu Sans" w:hAnsi="DejaVu Sans"/>
-        </w:rPr>
-      </w:r>
-      <w:bookmarkStart w:id="22" w:name="__DdeLink__238_3734644865"/>
-      <w:bookmarkStart w:id="23" w:name="__DdeLink__238_3734644865"/>
-      <w:bookmarkEnd w:id="23"/>
-    </w:p>
     <w:sectPr>
       <w:footerReference w:type="even" r:id="rId4"/>
       <w:footerReference w:type="default" r:id="rId5"/>

</xml_diff>